<commit_message>
docs: add database schema, architecture diagrams, and markdown practice report
</commit_message>
<xml_diff>
--- a/project/report.docx
+++ b/project/report.docx
@@ -14,7 +14,7 @@
           <w:i w:val="0"/>
           <w:sz w:val="28"/>
         </w:rPr>
-        <w:t>МІНІСТЕРСТВО ОСВІТИ І НАУКИ УКРАЇНИ</w:t>
+        <w:t>ТОВАРИСТВО З ОБМЕЖЕНОЮ ВІДПОВІДАЛЬНІСТЮ</w:t>
       </w:r>
     </w:p>
     <w:p>
@@ -29,7 +29,7 @@
           <w:i w:val="0"/>
           <w:sz w:val="28"/>
         </w:rPr>
-        <w:t>НАЦІОНАЛЬНИЙ ТЕХНІЧНИЙ УНІВЕРСИТЕТ</w:t>
+        <w:t>«ФАХОВИЙ ПЕРЕДВИЩИЙ КОЛЕДЖ «ОПТІМА»</w:t>
       </w:r>
     </w:p>
     <w:p>
@@ -44,22 +44,7 @@
           <w:i w:val="0"/>
           <w:sz w:val="28"/>
         </w:rPr>
-        <w:t>ФАКУЛЬТЕТ ІНФОРМАЦІЙНИХ ТЕХНОЛОГІЙ ТА КОМП'ЮТЕРНОЇ ІНЖЕНЕРІЇ</w:t>
-      </w:r>
-    </w:p>
-    <w:p>
-      <w:pPr>
-        <w:spacing w:line="360" w:lineRule="auto"/>
-        <w:jc w:val="center"/>
-      </w:pPr>
-      <w:r>
-        <w:rPr>
-          <w:rFonts w:ascii="Times New Roman" w:hAnsi="Times New Roman"/>
-          <w:b w:val="0"/>
-          <w:i w:val="0"/>
-          <w:sz w:val="28"/>
-        </w:rPr>
-        <w:t>КАФЕДРА ІНЖЕНЕРІЇ ПРОГРАМНОГО ЗАБЕЗПЕЧЕННЯ</w:t>
+        <w:t>Циклова комісія інформаційних технологій та фізико-математичних дисциплін</w:t>
       </w:r>
     </w:p>
     <w:p>
@@ -134,7 +119,7 @@
           <w:i w:val="0"/>
           <w:sz w:val="28"/>
         </w:rPr>
-        <w:t>на тему: «ВЕБСИСТЕМА ОНЛАЙН-ЗАМОВЛЕНЬ У КАВ'ЯРНІ»</w:t>
+        <w:t>на тему: «ВЕБСИСТЕМА ОНЛАЙН-ЗАМОВЛЕНЬ У КАВ'ЯРНІ «OPTIMA COFFEE»»</w:t>
       </w:r>
     </w:p>
     <w:p>
@@ -163,16 +148,14 @@
           <w:i w:val="0"/>
           <w:sz w:val="28"/>
         </w:rPr>
-        <w:t>Виконав: студент IV курсу, групи СПЗ-21</w:t>
-        <w:br/>
-        <w:t>спеціальності 121 «Інженерія програмного забезпечення»</w:t>
+        <w:t>Виконав: студент групи КН-44</w:t>
         <w:br/>
         <w:t>Доценко А. В.</w:t>
         <w:br/>
         <w:br/>
-        <w:t>Керівник практики від університету:</w:t>
+        <w:t>Керівник практики від коледжу:</w:t>
         <w:br/>
-        <w:t>к.т.н., доцент Коваленко О. І.</w:t>
+        <w:t>__________________</w:t>
         <w:br/>
         <w:br/>
         <w:t>Оцінка: ______________ / __________________</w:t>
@@ -237,7 +220,7 @@
           <w:i w:val="0"/>
           <w:sz w:val="28"/>
         </w:rPr>
-        <w:t>Практика проведена відповідно до наказу ректора Національного технічного університету № 142-с від 10 серпня 2026 року згідно з навчальним планом підготовки фахівців першого (бакалаврського) рівня вищої освіти за спеціальністю 121 «Інженерія програмного забезпечення».</w:t>
+        <w:t>Практика проведена відповідно до навчального плану підготовки фахівців фахової передвищої освіти за спеціальністю «Комп'ютерні науки» та наказу директора ТОВ «Фаховий передвищий коледж «Оптіма» від 15 серпня 2026 року.</w:t>
       </w:r>
     </w:p>
     <w:p>
@@ -252,7 +235,22 @@
           <w:i w:val="0"/>
           <w:sz w:val="28"/>
         </w:rPr>
-        <w:t>Тема індивідуального завдання: «Розробка повнофункціональної вебсистеми онлайн-замовлень у кав'ярні» (напрям «Компанія 2», тематика T2).</w:t>
+        <w:t>Індивідуальне завдання з практики студента групи КН-44 Доценка Анатолія Віталійовича. Тема проєктного завдання: «Вебсистема онлайн-замовлень у кав’ярні «Optima Coffee».</w:t>
+      </w:r>
+    </w:p>
+    <w:p>
+      <w:pPr>
+        <w:spacing w:line="360" w:lineRule="auto"/>
+        <w:ind w:firstLine="709"/>
+        <w:jc w:val="both"/>
+      </w:pPr>
+      <w:r>
+        <w:rPr>
+          <w:rFonts w:ascii="Times New Roman" w:hAnsi="Times New Roman"/>
+          <w:i w:val="0"/>
+          <w:sz w:val="28"/>
+        </w:rPr>
+        <w:t>Концепція ПЗ та технічні умови: трирівнева архітектура з ізоляцією бізнес-логіки; Python 3.11+, FastAPI, Pydantic v2, SQLAlchemy 2.0, Alembic; JWT (HS256, строк дії 60 хв), bcrypt, RBAC «клієнт / бариста-адміністратор»; PostgreSQL 16 в окремому контейнері з томом pgdata; SPA Vanilla JavaScript (360–1920 px); REST API /api/v1 з OpenAPI 3.1; розгортання в Podman Compose; тестування pytest/httpx (50 тестів); оформлення за ДСТУ 3008:2015.</w:t>
       </w:r>
     </w:p>
     <w:p>
@@ -282,24 +280,9 @@
           <w:i w:val="0"/>
           <w:sz w:val="28"/>
         </w:rPr>
-        <w:t>Керівник практики від кафедри: доцент кафедри інженерії програмного забезпечення, к.т.н. Коваленко О. І.</w:t>
-      </w:r>
-    </w:p>
-    <w:p>
-      <w:pPr>
-        <w:spacing w:line="360" w:lineRule="auto"/>
-        <w:ind w:firstLine="709"/>
-        <w:jc w:val="both"/>
-      </w:pPr>
-      <w:r>
-        <w:rPr>
-          <w:rFonts w:ascii="Times New Roman" w:hAnsi="Times New Roman"/>
-          <w:i w:val="0"/>
-          <w:sz w:val="28"/>
-        </w:rPr>
         <w:t>Підписи сторін:</w:t>
         <w:br/>
-        <w:t>Керівник практики: ______________________ (О. І. Коваленко)</w:t>
+        <w:t>Керівник практики: ______________________</w:t>
         <w:br/>
         <w:t>Студент-практикант: ______________________ (А. В. Доценко)</w:t>
       </w:r>
@@ -5659,7 +5642,7 @@
           <w:i w:val="0"/>
           <w:sz w:val="28"/>
         </w:rPr>
-        <w:t>Для забезпечення безпеки паролі хешуються за допомогою алгоритму bcrypt. Авторизований доступ регулюється токенами JWT з терміном дії 24 години. Адміністративні ендпоїнти захищені залежністю `get_current_admin_user`, що відхиляє несанкціоновані спроби доступу кодом HTTP 403 Forbidden [9].</w:t>
+        <w:t>Для забезпечення безпеки паролі хешуються за допомогою алгоритму bcrypt. Авторизований доступ регулюється токенами JWT з алгоритмом HS256 та терміном дії 60 хвилин. Адміністративні ендпоїнти захищені залежністю `get_current_admin_user`, що відхиляє несанкціоновані спроби доступу кодом HTTP 403 Forbidden [9].</w:t>
       </w:r>
     </w:p>
     <w:p>

</xml_diff>